<commit_message>
Fix RAG engine: proper URL formatting, building links, campus map image
- Fix NumPy 2.0 compatibility (downgrade to <2.0 for ChromaDB 0.5)
- Fix docx chunking to keep table rows intact (no more split URLs)
- Format raw URLs as clickable markdown links (Apple Maps, Google Maps)
- Always include building map links when user asks about buildings
- Add dedicated campus map response with image, PDF, and links
- Add campus map PNG image to public assets
- Update MessageBubble to render images in chat
- Increase top_k_results to 15 for better retrieval
- Update Cal_Poly_Buildings_Links.docx (renamed, 805 Kitchen -> Cal Poly Dining Hall)
</commit_message>
<xml_diff>
--- a/backend/data/knowledge_base/ChicoData.docx
+++ b/backend/data/knowledge_base/ChicoData.docx
@@ -1279,36 +1279,6 @@
           <w:t>https://www.csuchico.edu/maps/campus/</w:t>
         </w:r>
       </w:hyperlink>
-    </w:p>
-    <w:p/>
-    <w:p>
-      <w:r>
-        <w:rPr>
-          <w:b/>
-          <w:sz w:val="28"/>
-        </w:rPr>
-        <w:t>Additional Data Sources</w:t>
-      </w:r>
-    </w:p>
-    <w:p>
-      <w:r>
-        <w:t>• https://www.downtownchico.com/</w:t>
-      </w:r>
-    </w:p>
-    <w:p>
-      <w:r>
-        <w:t>• https://www.csuchico.edu/academics/majors-programs/index.shtml</w:t>
-      </w:r>
-    </w:p>
-    <w:p>
-      <w:r>
-        <w:t>• https://www.csuchico.edu/sustainability/ride/bus.shtml</w:t>
-      </w:r>
-    </w:p>
-    <w:p>
-      <w:r>
-        <w:t>• https://www.csuchico.edu/espanol/index.shtml</w:t>
-      </w:r>
     </w:p>
     <w:sectPr>
       <w:pgSz w:w="15840" w:h="12240" w:orient="landscape"/>

</xml_diff>